<commit_message>
change column sizes in merged doc
</commit_message>
<xml_diff>
--- a/merged_documents/legacy_merged.docx
+++ b/merged_documents/legacy_merged.docx
@@ -4,7 +4,7 @@
   <w:body>
     <w:tbl>
       <w:tblPr>
-        <w:tblW w:w="0" w:type="auto"/>
+        <w:tblW w:w="9354" w:type="dxa"/>
         <w:tblBorders>
           <w:top w:val="single" w:sz="4" w:space="0" w:color="auto"/>
           <w:left w:val="single" w:sz="4" w:space="0" w:color="auto"/>
@@ -13,11 +13,12 @@
           <w:insideH w:val="single" w:sz="4" w:space="0" w:color="auto"/>
           <w:insideV w:val="single" w:sz="4" w:space="0" w:color="auto"/>
         </w:tblBorders>
+        <w:tblLayout w:type="fixed"/>
         <w:tblLook w:val="0000" w:firstRow="0" w:lastRow="0" w:firstColumn="0" w:lastColumn="0" w:noHBand="0" w:noVBand="0"/>
       </w:tblPr>
       <w:tblGrid>
-        <w:gridCol w:w="4672"/>
-        <w:gridCol w:w="4672"/>
+        <w:gridCol w:w="4677"/>
+        <w:gridCol w:w="4677"/>
       </w:tblGrid>
       <w:tr>
         <w:tblPrEx>
@@ -256,7 +257,7 @@
     </w:p>
     <w:tbl>
       <w:tblPr>
-        <w:tblW w:w="0" w:type="auto"/>
+        <w:tblW w:w="9354" w:type="dxa"/>
         <w:tblBorders>
           <w:top w:val="single" w:sz="4" w:space="0" w:color="auto"/>
           <w:left w:val="single" w:sz="4" w:space="0" w:color="auto"/>
@@ -265,11 +266,12 @@
           <w:insideH w:val="single" w:sz="4" w:space="0" w:color="auto"/>
           <w:insideV w:val="single" w:sz="4" w:space="0" w:color="auto"/>
         </w:tblBorders>
+        <w:tblLayout w:type="fixed"/>
         <w:tblLook w:val="0000" w:firstRow="0" w:lastRow="0" w:firstColumn="0" w:lastColumn="0" w:noHBand="0" w:noVBand="0"/>
       </w:tblPr>
       <w:tblGrid>
-        <w:gridCol w:w="4672"/>
-        <w:gridCol w:w="4672"/>
+        <w:gridCol w:w="4677"/>
+        <w:gridCol w:w="4677"/>
       </w:tblGrid>
       <w:tr>
         <w:tblPrEx>
@@ -888,7 +890,7 @@
     <w:link w:val="10"/>
     <w:uiPriority w:val="9"/>
     <w:qFormat/>
-    <w:rsid w:val="00FE7607"/>
+    <w:rsid w:val="00244729"/>
     <w:pPr>
       <w:keepNext/>
       <w:keepLines/>
@@ -911,7 +913,7 @@
     <w:semiHidden/>
     <w:unhideWhenUsed/>
     <w:qFormat/>
-    <w:rsid w:val="00FE7607"/>
+    <w:rsid w:val="00244729"/>
     <w:pPr>
       <w:keepNext/>
       <w:keepLines/>
@@ -934,7 +936,7 @@
     <w:semiHidden/>
     <w:unhideWhenUsed/>
     <w:qFormat/>
-    <w:rsid w:val="00FE7607"/>
+    <w:rsid w:val="00244729"/>
     <w:pPr>
       <w:keepNext/>
       <w:keepLines/>
@@ -956,7 +958,7 @@
     <w:semiHidden/>
     <w:unhideWhenUsed/>
     <w:qFormat/>
-    <w:rsid w:val="00FE7607"/>
+    <w:rsid w:val="00244729"/>
     <w:pPr>
       <w:keepNext/>
       <w:keepLines/>
@@ -979,7 +981,7 @@
     <w:semiHidden/>
     <w:unhideWhenUsed/>
     <w:qFormat/>
-    <w:rsid w:val="00FE7607"/>
+    <w:rsid w:val="00244729"/>
     <w:pPr>
       <w:keepNext/>
       <w:keepLines/>
@@ -1000,7 +1002,7 @@
     <w:semiHidden/>
     <w:unhideWhenUsed/>
     <w:qFormat/>
-    <w:rsid w:val="00FE7607"/>
+    <w:rsid w:val="00244729"/>
     <w:pPr>
       <w:keepNext/>
       <w:keepLines/>
@@ -1023,7 +1025,7 @@
     <w:semiHidden/>
     <w:unhideWhenUsed/>
     <w:qFormat/>
-    <w:rsid w:val="00FE7607"/>
+    <w:rsid w:val="00244729"/>
     <w:pPr>
       <w:keepNext/>
       <w:keepLines/>
@@ -1044,7 +1046,7 @@
     <w:semiHidden/>
     <w:unhideWhenUsed/>
     <w:qFormat/>
-    <w:rsid w:val="00FE7607"/>
+    <w:rsid w:val="00244729"/>
     <w:pPr>
       <w:keepNext/>
       <w:keepLines/>
@@ -1067,7 +1069,7 @@
     <w:semiHidden/>
     <w:unhideWhenUsed/>
     <w:qFormat/>
-    <w:rsid w:val="00FE7607"/>
+    <w:rsid w:val="00244729"/>
     <w:pPr>
       <w:keepNext/>
       <w:keepLines/>
@@ -1111,7 +1113,7 @@
     <w:basedOn w:val="a0"/>
     <w:link w:val="1"/>
     <w:uiPriority w:val="9"/>
-    <w:rsid w:val="00FE7607"/>
+    <w:rsid w:val="00244729"/>
     <w:rPr>
       <w:rFonts w:asciiTheme="majorHAnsi" w:eastAsiaTheme="majorEastAsia" w:hAnsiTheme="majorHAnsi" w:cstheme="majorBidi"/>
       <w:color w:val="2F5496" w:themeColor="accent1" w:themeShade="BF"/>
@@ -1127,7 +1129,7 @@
     <w:link w:val="2"/>
     <w:uiPriority w:val="9"/>
     <w:semiHidden/>
-    <w:rsid w:val="00FE7607"/>
+    <w:rsid w:val="00244729"/>
     <w:rPr>
       <w:rFonts w:asciiTheme="majorHAnsi" w:eastAsiaTheme="majorEastAsia" w:hAnsiTheme="majorHAnsi" w:cstheme="majorBidi"/>
       <w:color w:val="2F5496" w:themeColor="accent1" w:themeShade="BF"/>
@@ -1143,7 +1145,7 @@
     <w:link w:val="3"/>
     <w:uiPriority w:val="9"/>
     <w:semiHidden/>
-    <w:rsid w:val="00FE7607"/>
+    <w:rsid w:val="00244729"/>
     <w:rPr>
       <w:rFonts w:eastAsiaTheme="majorEastAsia" w:cstheme="majorBidi"/>
       <w:color w:val="2F5496" w:themeColor="accent1" w:themeShade="BF"/>
@@ -1159,7 +1161,7 @@
     <w:link w:val="4"/>
     <w:uiPriority w:val="9"/>
     <w:semiHidden/>
-    <w:rsid w:val="00FE7607"/>
+    <w:rsid w:val="00244729"/>
     <w:rPr>
       <w:rFonts w:eastAsiaTheme="majorEastAsia" w:cstheme="majorBidi"/>
       <w:i/>
@@ -1176,7 +1178,7 @@
     <w:link w:val="5"/>
     <w:uiPriority w:val="9"/>
     <w:semiHidden/>
-    <w:rsid w:val="00FE7607"/>
+    <w:rsid w:val="00244729"/>
     <w:rPr>
       <w:rFonts w:eastAsiaTheme="majorEastAsia" w:cstheme="majorBidi"/>
       <w:color w:val="2F5496" w:themeColor="accent1" w:themeShade="BF"/>
@@ -1191,7 +1193,7 @@
     <w:link w:val="6"/>
     <w:uiPriority w:val="9"/>
     <w:semiHidden/>
-    <w:rsid w:val="00FE7607"/>
+    <w:rsid w:val="00244729"/>
     <w:rPr>
       <w:rFonts w:eastAsiaTheme="majorEastAsia" w:cstheme="majorBidi"/>
       <w:i/>
@@ -1208,7 +1210,7 @@
     <w:link w:val="7"/>
     <w:uiPriority w:val="9"/>
     <w:semiHidden/>
-    <w:rsid w:val="00FE7607"/>
+    <w:rsid w:val="00244729"/>
     <w:rPr>
       <w:rFonts w:eastAsiaTheme="majorEastAsia" w:cstheme="majorBidi"/>
       <w:color w:val="595959" w:themeColor="text1" w:themeTint="A6"/>
@@ -1223,7 +1225,7 @@
     <w:link w:val="8"/>
     <w:uiPriority w:val="9"/>
     <w:semiHidden/>
-    <w:rsid w:val="00FE7607"/>
+    <w:rsid w:val="00244729"/>
     <w:rPr>
       <w:rFonts w:eastAsiaTheme="majorEastAsia" w:cstheme="majorBidi"/>
       <w:i/>
@@ -1240,7 +1242,7 @@
     <w:link w:val="9"/>
     <w:uiPriority w:val="9"/>
     <w:semiHidden/>
-    <w:rsid w:val="00FE7607"/>
+    <w:rsid w:val="00244729"/>
     <w:rPr>
       <w:rFonts w:eastAsiaTheme="majorEastAsia" w:cstheme="majorBidi"/>
       <w:color w:val="272727" w:themeColor="text1" w:themeTint="D8"/>
@@ -1256,7 +1258,7 @@
     <w:link w:val="a4"/>
     <w:uiPriority w:val="10"/>
     <w:qFormat/>
-    <w:rsid w:val="00FE7607"/>
+    <w:rsid w:val="00244729"/>
     <w:pPr>
       <w:spacing w:after="80"/>
       <w:contextualSpacing/>
@@ -1274,7 +1276,7 @@
     <w:basedOn w:val="a0"/>
     <w:link w:val="a3"/>
     <w:uiPriority w:val="10"/>
-    <w:rsid w:val="00FE7607"/>
+    <w:rsid w:val="00244729"/>
     <w:rPr>
       <w:rFonts w:asciiTheme="majorHAnsi" w:eastAsiaTheme="majorEastAsia" w:hAnsiTheme="majorHAnsi" w:cstheme="majorBidi"/>
       <w:spacing w:val="-10"/>
@@ -1291,7 +1293,7 @@
     <w:link w:val="a6"/>
     <w:uiPriority w:val="11"/>
     <w:qFormat/>
-    <w:rsid w:val="00FE7607"/>
+    <w:rsid w:val="00244729"/>
     <w:pPr>
       <w:numPr>
         <w:ilvl w:val="1"/>
@@ -1309,7 +1311,7 @@
     <w:basedOn w:val="a0"/>
     <w:link w:val="a5"/>
     <w:uiPriority w:val="11"/>
-    <w:rsid w:val="00FE7607"/>
+    <w:rsid w:val="00244729"/>
     <w:rPr>
       <w:rFonts w:eastAsiaTheme="majorEastAsia" w:cstheme="majorBidi"/>
       <w:color w:val="595959" w:themeColor="text1" w:themeTint="A6"/>
@@ -1327,7 +1329,7 @@
     <w:link w:val="22"/>
     <w:uiPriority w:val="29"/>
     <w:qFormat/>
-    <w:rsid w:val="00FE7607"/>
+    <w:rsid w:val="00244729"/>
     <w:pPr>
       <w:spacing w:before="160"/>
       <w:jc w:val="center"/>
@@ -1343,7 +1345,7 @@
     <w:basedOn w:val="a0"/>
     <w:link w:val="21"/>
     <w:uiPriority w:val="29"/>
-    <w:rsid w:val="00FE7607"/>
+    <w:rsid w:val="00244729"/>
     <w:rPr>
       <w:rFonts w:ascii="Times New Roman" w:hAnsi="Times New Roman"/>
       <w:i/>
@@ -1359,7 +1361,7 @@
     <w:basedOn w:val="a"/>
     <w:uiPriority w:val="34"/>
     <w:qFormat/>
-    <w:rsid w:val="00FE7607"/>
+    <w:rsid w:val="00244729"/>
     <w:pPr>
       <w:ind w:left="720"/>
       <w:contextualSpacing/>
@@ -1370,7 +1372,7 @@
     <w:basedOn w:val="a0"/>
     <w:uiPriority w:val="21"/>
     <w:qFormat/>
-    <w:rsid w:val="00FE7607"/>
+    <w:rsid w:val="00244729"/>
     <w:rPr>
       <w:i/>
       <w:iCs/>
@@ -1384,7 +1386,7 @@
     <w:link w:val="aa"/>
     <w:uiPriority w:val="30"/>
     <w:qFormat/>
-    <w:rsid w:val="00FE7607"/>
+    <w:rsid w:val="00244729"/>
     <w:pPr>
       <w:pBdr>
         <w:top w:val="single" w:sz="4" w:space="10" w:color="2F5496" w:themeColor="accent1" w:themeShade="BF"/>
@@ -1405,7 +1407,7 @@
     <w:basedOn w:val="a0"/>
     <w:link w:val="a9"/>
     <w:uiPriority w:val="30"/>
-    <w:rsid w:val="00FE7607"/>
+    <w:rsid w:val="00244729"/>
     <w:rPr>
       <w:rFonts w:ascii="Times New Roman" w:hAnsi="Times New Roman"/>
       <w:i/>
@@ -1421,7 +1423,7 @@
     <w:basedOn w:val="a0"/>
     <w:uiPriority w:val="32"/>
     <w:qFormat/>
-    <w:rsid w:val="00FE7607"/>
+    <w:rsid w:val="00244729"/>
     <w:rPr>
       <w:b/>
       <w:bCs/>
@@ -1436,7 +1438,7 @@
     <w:link w:val="ad"/>
     <w:uiPriority w:val="99"/>
     <w:unhideWhenUsed/>
-    <w:rsid w:val="00FE7607"/>
+    <w:rsid w:val="00244729"/>
     <w:pPr>
       <w:tabs>
         <w:tab w:val="center" w:pos="4513"/>
@@ -1450,7 +1452,7 @@
     <w:basedOn w:val="a0"/>
     <w:link w:val="ac"/>
     <w:uiPriority w:val="99"/>
-    <w:rsid w:val="00FE7607"/>
+    <w:rsid w:val="00244729"/>
     <w:rPr>
       <w:rFonts w:ascii="Times New Roman" w:hAnsi="Times New Roman"/>
       <w:kern w:val="0"/>
@@ -1464,7 +1466,7 @@
     <w:link w:val="af"/>
     <w:uiPriority w:val="99"/>
     <w:unhideWhenUsed/>
-    <w:rsid w:val="00FE7607"/>
+    <w:rsid w:val="00244729"/>
     <w:pPr>
       <w:tabs>
         <w:tab w:val="center" w:pos="4513"/>
@@ -1478,7 +1480,7 @@
     <w:basedOn w:val="a0"/>
     <w:link w:val="ae"/>
     <w:uiPriority w:val="99"/>
-    <w:rsid w:val="00FE7607"/>
+    <w:rsid w:val="00244729"/>
     <w:rPr>
       <w:rFonts w:ascii="Times New Roman" w:hAnsi="Times New Roman"/>
       <w:kern w:val="0"/>

</xml_diff>

<commit_message>
fix error when parsing from .doc
</commit_message>
<xml_diff>
--- a/merged_documents/legacy_merged.docx
+++ b/merged_documents/legacy_merged.docx
@@ -890,7 +890,7 @@
     <w:link w:val="10"/>
     <w:uiPriority w:val="9"/>
     <w:qFormat/>
-    <w:rsid w:val="00244729"/>
+    <w:rsid w:val="003835A8"/>
     <w:pPr>
       <w:keepNext/>
       <w:keepLines/>
@@ -913,7 +913,7 @@
     <w:semiHidden/>
     <w:unhideWhenUsed/>
     <w:qFormat/>
-    <w:rsid w:val="00244729"/>
+    <w:rsid w:val="003835A8"/>
     <w:pPr>
       <w:keepNext/>
       <w:keepLines/>
@@ -936,7 +936,7 @@
     <w:semiHidden/>
     <w:unhideWhenUsed/>
     <w:qFormat/>
-    <w:rsid w:val="00244729"/>
+    <w:rsid w:val="003835A8"/>
     <w:pPr>
       <w:keepNext/>
       <w:keepLines/>
@@ -958,7 +958,7 @@
     <w:semiHidden/>
     <w:unhideWhenUsed/>
     <w:qFormat/>
-    <w:rsid w:val="00244729"/>
+    <w:rsid w:val="003835A8"/>
     <w:pPr>
       <w:keepNext/>
       <w:keepLines/>
@@ -981,7 +981,7 @@
     <w:semiHidden/>
     <w:unhideWhenUsed/>
     <w:qFormat/>
-    <w:rsid w:val="00244729"/>
+    <w:rsid w:val="003835A8"/>
     <w:pPr>
       <w:keepNext/>
       <w:keepLines/>
@@ -1002,7 +1002,7 @@
     <w:semiHidden/>
     <w:unhideWhenUsed/>
     <w:qFormat/>
-    <w:rsid w:val="00244729"/>
+    <w:rsid w:val="003835A8"/>
     <w:pPr>
       <w:keepNext/>
       <w:keepLines/>
@@ -1025,7 +1025,7 @@
     <w:semiHidden/>
     <w:unhideWhenUsed/>
     <w:qFormat/>
-    <w:rsid w:val="00244729"/>
+    <w:rsid w:val="003835A8"/>
     <w:pPr>
       <w:keepNext/>
       <w:keepLines/>
@@ -1046,7 +1046,7 @@
     <w:semiHidden/>
     <w:unhideWhenUsed/>
     <w:qFormat/>
-    <w:rsid w:val="00244729"/>
+    <w:rsid w:val="003835A8"/>
     <w:pPr>
       <w:keepNext/>
       <w:keepLines/>
@@ -1069,7 +1069,7 @@
     <w:semiHidden/>
     <w:unhideWhenUsed/>
     <w:qFormat/>
-    <w:rsid w:val="00244729"/>
+    <w:rsid w:val="003835A8"/>
     <w:pPr>
       <w:keepNext/>
       <w:keepLines/>
@@ -1113,7 +1113,7 @@
     <w:basedOn w:val="a0"/>
     <w:link w:val="1"/>
     <w:uiPriority w:val="9"/>
-    <w:rsid w:val="00244729"/>
+    <w:rsid w:val="003835A8"/>
     <w:rPr>
       <w:rFonts w:asciiTheme="majorHAnsi" w:eastAsiaTheme="majorEastAsia" w:hAnsiTheme="majorHAnsi" w:cstheme="majorBidi"/>
       <w:color w:val="2F5496" w:themeColor="accent1" w:themeShade="BF"/>
@@ -1129,7 +1129,7 @@
     <w:link w:val="2"/>
     <w:uiPriority w:val="9"/>
     <w:semiHidden/>
-    <w:rsid w:val="00244729"/>
+    <w:rsid w:val="003835A8"/>
     <w:rPr>
       <w:rFonts w:asciiTheme="majorHAnsi" w:eastAsiaTheme="majorEastAsia" w:hAnsiTheme="majorHAnsi" w:cstheme="majorBidi"/>
       <w:color w:val="2F5496" w:themeColor="accent1" w:themeShade="BF"/>
@@ -1145,7 +1145,7 @@
     <w:link w:val="3"/>
     <w:uiPriority w:val="9"/>
     <w:semiHidden/>
-    <w:rsid w:val="00244729"/>
+    <w:rsid w:val="003835A8"/>
     <w:rPr>
       <w:rFonts w:eastAsiaTheme="majorEastAsia" w:cstheme="majorBidi"/>
       <w:color w:val="2F5496" w:themeColor="accent1" w:themeShade="BF"/>
@@ -1161,7 +1161,7 @@
     <w:link w:val="4"/>
     <w:uiPriority w:val="9"/>
     <w:semiHidden/>
-    <w:rsid w:val="00244729"/>
+    <w:rsid w:val="003835A8"/>
     <w:rPr>
       <w:rFonts w:eastAsiaTheme="majorEastAsia" w:cstheme="majorBidi"/>
       <w:i/>
@@ -1178,7 +1178,7 @@
     <w:link w:val="5"/>
     <w:uiPriority w:val="9"/>
     <w:semiHidden/>
-    <w:rsid w:val="00244729"/>
+    <w:rsid w:val="003835A8"/>
     <w:rPr>
       <w:rFonts w:eastAsiaTheme="majorEastAsia" w:cstheme="majorBidi"/>
       <w:color w:val="2F5496" w:themeColor="accent1" w:themeShade="BF"/>
@@ -1193,7 +1193,7 @@
     <w:link w:val="6"/>
     <w:uiPriority w:val="9"/>
     <w:semiHidden/>
-    <w:rsid w:val="00244729"/>
+    <w:rsid w:val="003835A8"/>
     <w:rPr>
       <w:rFonts w:eastAsiaTheme="majorEastAsia" w:cstheme="majorBidi"/>
       <w:i/>
@@ -1210,7 +1210,7 @@
     <w:link w:val="7"/>
     <w:uiPriority w:val="9"/>
     <w:semiHidden/>
-    <w:rsid w:val="00244729"/>
+    <w:rsid w:val="003835A8"/>
     <w:rPr>
       <w:rFonts w:eastAsiaTheme="majorEastAsia" w:cstheme="majorBidi"/>
       <w:color w:val="595959" w:themeColor="text1" w:themeTint="A6"/>
@@ -1225,7 +1225,7 @@
     <w:link w:val="8"/>
     <w:uiPriority w:val="9"/>
     <w:semiHidden/>
-    <w:rsid w:val="00244729"/>
+    <w:rsid w:val="003835A8"/>
     <w:rPr>
       <w:rFonts w:eastAsiaTheme="majorEastAsia" w:cstheme="majorBidi"/>
       <w:i/>
@@ -1242,7 +1242,7 @@
     <w:link w:val="9"/>
     <w:uiPriority w:val="9"/>
     <w:semiHidden/>
-    <w:rsid w:val="00244729"/>
+    <w:rsid w:val="003835A8"/>
     <w:rPr>
       <w:rFonts w:eastAsiaTheme="majorEastAsia" w:cstheme="majorBidi"/>
       <w:color w:val="272727" w:themeColor="text1" w:themeTint="D8"/>
@@ -1258,7 +1258,7 @@
     <w:link w:val="a4"/>
     <w:uiPriority w:val="10"/>
     <w:qFormat/>
-    <w:rsid w:val="00244729"/>
+    <w:rsid w:val="003835A8"/>
     <w:pPr>
       <w:spacing w:after="80"/>
       <w:contextualSpacing/>
@@ -1276,7 +1276,7 @@
     <w:basedOn w:val="a0"/>
     <w:link w:val="a3"/>
     <w:uiPriority w:val="10"/>
-    <w:rsid w:val="00244729"/>
+    <w:rsid w:val="003835A8"/>
     <w:rPr>
       <w:rFonts w:asciiTheme="majorHAnsi" w:eastAsiaTheme="majorEastAsia" w:hAnsiTheme="majorHAnsi" w:cstheme="majorBidi"/>
       <w:spacing w:val="-10"/>
@@ -1293,7 +1293,7 @@
     <w:link w:val="a6"/>
     <w:uiPriority w:val="11"/>
     <w:qFormat/>
-    <w:rsid w:val="00244729"/>
+    <w:rsid w:val="003835A8"/>
     <w:pPr>
       <w:numPr>
         <w:ilvl w:val="1"/>
@@ -1311,7 +1311,7 @@
     <w:basedOn w:val="a0"/>
     <w:link w:val="a5"/>
     <w:uiPriority w:val="11"/>
-    <w:rsid w:val="00244729"/>
+    <w:rsid w:val="003835A8"/>
     <w:rPr>
       <w:rFonts w:eastAsiaTheme="majorEastAsia" w:cstheme="majorBidi"/>
       <w:color w:val="595959" w:themeColor="text1" w:themeTint="A6"/>
@@ -1329,7 +1329,7 @@
     <w:link w:val="22"/>
     <w:uiPriority w:val="29"/>
     <w:qFormat/>
-    <w:rsid w:val="00244729"/>
+    <w:rsid w:val="003835A8"/>
     <w:pPr>
       <w:spacing w:before="160"/>
       <w:jc w:val="center"/>
@@ -1345,7 +1345,7 @@
     <w:basedOn w:val="a0"/>
     <w:link w:val="21"/>
     <w:uiPriority w:val="29"/>
-    <w:rsid w:val="00244729"/>
+    <w:rsid w:val="003835A8"/>
     <w:rPr>
       <w:rFonts w:ascii="Times New Roman" w:hAnsi="Times New Roman"/>
       <w:i/>
@@ -1361,7 +1361,7 @@
     <w:basedOn w:val="a"/>
     <w:uiPriority w:val="34"/>
     <w:qFormat/>
-    <w:rsid w:val="00244729"/>
+    <w:rsid w:val="003835A8"/>
     <w:pPr>
       <w:ind w:left="720"/>
       <w:contextualSpacing/>
@@ -1372,7 +1372,7 @@
     <w:basedOn w:val="a0"/>
     <w:uiPriority w:val="21"/>
     <w:qFormat/>
-    <w:rsid w:val="00244729"/>
+    <w:rsid w:val="003835A8"/>
     <w:rPr>
       <w:i/>
       <w:iCs/>
@@ -1386,7 +1386,7 @@
     <w:link w:val="aa"/>
     <w:uiPriority w:val="30"/>
     <w:qFormat/>
-    <w:rsid w:val="00244729"/>
+    <w:rsid w:val="003835A8"/>
     <w:pPr>
       <w:pBdr>
         <w:top w:val="single" w:sz="4" w:space="10" w:color="2F5496" w:themeColor="accent1" w:themeShade="BF"/>
@@ -1407,7 +1407,7 @@
     <w:basedOn w:val="a0"/>
     <w:link w:val="a9"/>
     <w:uiPriority w:val="30"/>
-    <w:rsid w:val="00244729"/>
+    <w:rsid w:val="003835A8"/>
     <w:rPr>
       <w:rFonts w:ascii="Times New Roman" w:hAnsi="Times New Roman"/>
       <w:i/>
@@ -1423,7 +1423,7 @@
     <w:basedOn w:val="a0"/>
     <w:uiPriority w:val="32"/>
     <w:qFormat/>
-    <w:rsid w:val="00244729"/>
+    <w:rsid w:val="003835A8"/>
     <w:rPr>
       <w:b/>
       <w:bCs/>
@@ -1438,7 +1438,7 @@
     <w:link w:val="ad"/>
     <w:uiPriority w:val="99"/>
     <w:unhideWhenUsed/>
-    <w:rsid w:val="00244729"/>
+    <w:rsid w:val="003835A8"/>
     <w:pPr>
       <w:tabs>
         <w:tab w:val="center" w:pos="4513"/>
@@ -1452,7 +1452,7 @@
     <w:basedOn w:val="a0"/>
     <w:link w:val="ac"/>
     <w:uiPriority w:val="99"/>
-    <w:rsid w:val="00244729"/>
+    <w:rsid w:val="003835A8"/>
     <w:rPr>
       <w:rFonts w:ascii="Times New Roman" w:hAnsi="Times New Roman"/>
       <w:kern w:val="0"/>
@@ -1466,7 +1466,7 @@
     <w:link w:val="af"/>
     <w:uiPriority w:val="99"/>
     <w:unhideWhenUsed/>
-    <w:rsid w:val="00244729"/>
+    <w:rsid w:val="003835A8"/>
     <w:pPr>
       <w:tabs>
         <w:tab w:val="center" w:pos="4513"/>
@@ -1480,7 +1480,7 @@
     <w:basedOn w:val="a0"/>
     <w:link w:val="ae"/>
     <w:uiPriority w:val="99"/>
-    <w:rsid w:val="00244729"/>
+    <w:rsid w:val="003835A8"/>
     <w:rPr>
       <w:rFonts w:ascii="Times New Roman" w:hAnsi="Times New Roman"/>
       <w:kern w:val="0"/>

</xml_diff>

<commit_message>
Fix error with roman numbers
</commit_message>
<xml_diff>
--- a/merged_documents/legacy_merged.docx
+++ b/merged_documents/legacy_merged.docx
@@ -890,7 +890,7 @@
     <w:link w:val="10"/>
     <w:uiPriority w:val="9"/>
     <w:qFormat/>
-    <w:rsid w:val="003835A8"/>
+    <w:rsid w:val="00CB3730"/>
     <w:pPr>
       <w:keepNext/>
       <w:keepLines/>
@@ -913,7 +913,7 @@
     <w:semiHidden/>
     <w:unhideWhenUsed/>
     <w:qFormat/>
-    <w:rsid w:val="003835A8"/>
+    <w:rsid w:val="00CB3730"/>
     <w:pPr>
       <w:keepNext/>
       <w:keepLines/>
@@ -936,7 +936,7 @@
     <w:semiHidden/>
     <w:unhideWhenUsed/>
     <w:qFormat/>
-    <w:rsid w:val="003835A8"/>
+    <w:rsid w:val="00CB3730"/>
     <w:pPr>
       <w:keepNext/>
       <w:keepLines/>
@@ -958,7 +958,7 @@
     <w:semiHidden/>
     <w:unhideWhenUsed/>
     <w:qFormat/>
-    <w:rsid w:val="003835A8"/>
+    <w:rsid w:val="00CB3730"/>
     <w:pPr>
       <w:keepNext/>
       <w:keepLines/>
@@ -981,7 +981,7 @@
     <w:semiHidden/>
     <w:unhideWhenUsed/>
     <w:qFormat/>
-    <w:rsid w:val="003835A8"/>
+    <w:rsid w:val="00CB3730"/>
     <w:pPr>
       <w:keepNext/>
       <w:keepLines/>
@@ -1002,7 +1002,7 @@
     <w:semiHidden/>
     <w:unhideWhenUsed/>
     <w:qFormat/>
-    <w:rsid w:val="003835A8"/>
+    <w:rsid w:val="00CB3730"/>
     <w:pPr>
       <w:keepNext/>
       <w:keepLines/>
@@ -1025,7 +1025,7 @@
     <w:semiHidden/>
     <w:unhideWhenUsed/>
     <w:qFormat/>
-    <w:rsid w:val="003835A8"/>
+    <w:rsid w:val="00CB3730"/>
     <w:pPr>
       <w:keepNext/>
       <w:keepLines/>
@@ -1046,7 +1046,7 @@
     <w:semiHidden/>
     <w:unhideWhenUsed/>
     <w:qFormat/>
-    <w:rsid w:val="003835A8"/>
+    <w:rsid w:val="00CB3730"/>
     <w:pPr>
       <w:keepNext/>
       <w:keepLines/>
@@ -1069,7 +1069,7 @@
     <w:semiHidden/>
     <w:unhideWhenUsed/>
     <w:qFormat/>
-    <w:rsid w:val="003835A8"/>
+    <w:rsid w:val="00CB3730"/>
     <w:pPr>
       <w:keepNext/>
       <w:keepLines/>
@@ -1113,7 +1113,7 @@
     <w:basedOn w:val="a0"/>
     <w:link w:val="1"/>
     <w:uiPriority w:val="9"/>
-    <w:rsid w:val="003835A8"/>
+    <w:rsid w:val="00CB3730"/>
     <w:rPr>
       <w:rFonts w:asciiTheme="majorHAnsi" w:eastAsiaTheme="majorEastAsia" w:hAnsiTheme="majorHAnsi" w:cstheme="majorBidi"/>
       <w:color w:val="2F5496" w:themeColor="accent1" w:themeShade="BF"/>
@@ -1129,7 +1129,7 @@
     <w:link w:val="2"/>
     <w:uiPriority w:val="9"/>
     <w:semiHidden/>
-    <w:rsid w:val="003835A8"/>
+    <w:rsid w:val="00CB3730"/>
     <w:rPr>
       <w:rFonts w:asciiTheme="majorHAnsi" w:eastAsiaTheme="majorEastAsia" w:hAnsiTheme="majorHAnsi" w:cstheme="majorBidi"/>
       <w:color w:val="2F5496" w:themeColor="accent1" w:themeShade="BF"/>
@@ -1145,7 +1145,7 @@
     <w:link w:val="3"/>
     <w:uiPriority w:val="9"/>
     <w:semiHidden/>
-    <w:rsid w:val="003835A8"/>
+    <w:rsid w:val="00CB3730"/>
     <w:rPr>
       <w:rFonts w:eastAsiaTheme="majorEastAsia" w:cstheme="majorBidi"/>
       <w:color w:val="2F5496" w:themeColor="accent1" w:themeShade="BF"/>
@@ -1161,7 +1161,7 @@
     <w:link w:val="4"/>
     <w:uiPriority w:val="9"/>
     <w:semiHidden/>
-    <w:rsid w:val="003835A8"/>
+    <w:rsid w:val="00CB3730"/>
     <w:rPr>
       <w:rFonts w:eastAsiaTheme="majorEastAsia" w:cstheme="majorBidi"/>
       <w:i/>
@@ -1178,7 +1178,7 @@
     <w:link w:val="5"/>
     <w:uiPriority w:val="9"/>
     <w:semiHidden/>
-    <w:rsid w:val="003835A8"/>
+    <w:rsid w:val="00CB3730"/>
     <w:rPr>
       <w:rFonts w:eastAsiaTheme="majorEastAsia" w:cstheme="majorBidi"/>
       <w:color w:val="2F5496" w:themeColor="accent1" w:themeShade="BF"/>
@@ -1193,7 +1193,7 @@
     <w:link w:val="6"/>
     <w:uiPriority w:val="9"/>
     <w:semiHidden/>
-    <w:rsid w:val="003835A8"/>
+    <w:rsid w:val="00CB3730"/>
     <w:rPr>
       <w:rFonts w:eastAsiaTheme="majorEastAsia" w:cstheme="majorBidi"/>
       <w:i/>
@@ -1210,7 +1210,7 @@
     <w:link w:val="7"/>
     <w:uiPriority w:val="9"/>
     <w:semiHidden/>
-    <w:rsid w:val="003835A8"/>
+    <w:rsid w:val="00CB3730"/>
     <w:rPr>
       <w:rFonts w:eastAsiaTheme="majorEastAsia" w:cstheme="majorBidi"/>
       <w:color w:val="595959" w:themeColor="text1" w:themeTint="A6"/>
@@ -1225,7 +1225,7 @@
     <w:link w:val="8"/>
     <w:uiPriority w:val="9"/>
     <w:semiHidden/>
-    <w:rsid w:val="003835A8"/>
+    <w:rsid w:val="00CB3730"/>
     <w:rPr>
       <w:rFonts w:eastAsiaTheme="majorEastAsia" w:cstheme="majorBidi"/>
       <w:i/>
@@ -1242,7 +1242,7 @@
     <w:link w:val="9"/>
     <w:uiPriority w:val="9"/>
     <w:semiHidden/>
-    <w:rsid w:val="003835A8"/>
+    <w:rsid w:val="00CB3730"/>
     <w:rPr>
       <w:rFonts w:eastAsiaTheme="majorEastAsia" w:cstheme="majorBidi"/>
       <w:color w:val="272727" w:themeColor="text1" w:themeTint="D8"/>
@@ -1258,7 +1258,7 @@
     <w:link w:val="a4"/>
     <w:uiPriority w:val="10"/>
     <w:qFormat/>
-    <w:rsid w:val="003835A8"/>
+    <w:rsid w:val="00CB3730"/>
     <w:pPr>
       <w:spacing w:after="80"/>
       <w:contextualSpacing/>
@@ -1276,7 +1276,7 @@
     <w:basedOn w:val="a0"/>
     <w:link w:val="a3"/>
     <w:uiPriority w:val="10"/>
-    <w:rsid w:val="003835A8"/>
+    <w:rsid w:val="00CB3730"/>
     <w:rPr>
       <w:rFonts w:asciiTheme="majorHAnsi" w:eastAsiaTheme="majorEastAsia" w:hAnsiTheme="majorHAnsi" w:cstheme="majorBidi"/>
       <w:spacing w:val="-10"/>
@@ -1293,7 +1293,7 @@
     <w:link w:val="a6"/>
     <w:uiPriority w:val="11"/>
     <w:qFormat/>
-    <w:rsid w:val="003835A8"/>
+    <w:rsid w:val="00CB3730"/>
     <w:pPr>
       <w:numPr>
         <w:ilvl w:val="1"/>
@@ -1311,7 +1311,7 @@
     <w:basedOn w:val="a0"/>
     <w:link w:val="a5"/>
     <w:uiPriority w:val="11"/>
-    <w:rsid w:val="003835A8"/>
+    <w:rsid w:val="00CB3730"/>
     <w:rPr>
       <w:rFonts w:eastAsiaTheme="majorEastAsia" w:cstheme="majorBidi"/>
       <w:color w:val="595959" w:themeColor="text1" w:themeTint="A6"/>
@@ -1329,7 +1329,7 @@
     <w:link w:val="22"/>
     <w:uiPriority w:val="29"/>
     <w:qFormat/>
-    <w:rsid w:val="003835A8"/>
+    <w:rsid w:val="00CB3730"/>
     <w:pPr>
       <w:spacing w:before="160"/>
       <w:jc w:val="center"/>
@@ -1345,7 +1345,7 @@
     <w:basedOn w:val="a0"/>
     <w:link w:val="21"/>
     <w:uiPriority w:val="29"/>
-    <w:rsid w:val="003835A8"/>
+    <w:rsid w:val="00CB3730"/>
     <w:rPr>
       <w:rFonts w:ascii="Times New Roman" w:hAnsi="Times New Roman"/>
       <w:i/>
@@ -1361,7 +1361,7 @@
     <w:basedOn w:val="a"/>
     <w:uiPriority w:val="34"/>
     <w:qFormat/>
-    <w:rsid w:val="003835A8"/>
+    <w:rsid w:val="00CB3730"/>
     <w:pPr>
       <w:ind w:left="720"/>
       <w:contextualSpacing/>
@@ -1372,7 +1372,7 @@
     <w:basedOn w:val="a0"/>
     <w:uiPriority w:val="21"/>
     <w:qFormat/>
-    <w:rsid w:val="003835A8"/>
+    <w:rsid w:val="00CB3730"/>
     <w:rPr>
       <w:i/>
       <w:iCs/>
@@ -1386,7 +1386,7 @@
     <w:link w:val="aa"/>
     <w:uiPriority w:val="30"/>
     <w:qFormat/>
-    <w:rsid w:val="003835A8"/>
+    <w:rsid w:val="00CB3730"/>
     <w:pPr>
       <w:pBdr>
         <w:top w:val="single" w:sz="4" w:space="10" w:color="2F5496" w:themeColor="accent1" w:themeShade="BF"/>
@@ -1407,7 +1407,7 @@
     <w:basedOn w:val="a0"/>
     <w:link w:val="a9"/>
     <w:uiPriority w:val="30"/>
-    <w:rsid w:val="003835A8"/>
+    <w:rsid w:val="00CB3730"/>
     <w:rPr>
       <w:rFonts w:ascii="Times New Roman" w:hAnsi="Times New Roman"/>
       <w:i/>
@@ -1423,7 +1423,7 @@
     <w:basedOn w:val="a0"/>
     <w:uiPriority w:val="32"/>
     <w:qFormat/>
-    <w:rsid w:val="003835A8"/>
+    <w:rsid w:val="00CB3730"/>
     <w:rPr>
       <w:b/>
       <w:bCs/>
@@ -1438,7 +1438,7 @@
     <w:link w:val="ad"/>
     <w:uiPriority w:val="99"/>
     <w:unhideWhenUsed/>
-    <w:rsid w:val="003835A8"/>
+    <w:rsid w:val="00CB3730"/>
     <w:pPr>
       <w:tabs>
         <w:tab w:val="center" w:pos="4513"/>
@@ -1452,7 +1452,7 @@
     <w:basedOn w:val="a0"/>
     <w:link w:val="ac"/>
     <w:uiPriority w:val="99"/>
-    <w:rsid w:val="003835A8"/>
+    <w:rsid w:val="00CB3730"/>
     <w:rPr>
       <w:rFonts w:ascii="Times New Roman" w:hAnsi="Times New Roman"/>
       <w:kern w:val="0"/>
@@ -1466,7 +1466,7 @@
     <w:link w:val="af"/>
     <w:uiPriority w:val="99"/>
     <w:unhideWhenUsed/>
-    <w:rsid w:val="003835A8"/>
+    <w:rsid w:val="00CB3730"/>
     <w:pPr>
       <w:tabs>
         <w:tab w:val="center" w:pos="4513"/>
@@ -1480,7 +1480,7 @@
     <w:basedOn w:val="a0"/>
     <w:link w:val="ae"/>
     <w:uiPriority w:val="99"/>
-    <w:rsid w:val="003835A8"/>
+    <w:rsid w:val="00CB3730"/>
     <w:rPr>
       <w:rFonts w:ascii="Times New Roman" w:hAnsi="Times New Roman"/>
       <w:kern w:val="0"/>

</xml_diff>